<commit_message>
Word-Stand auf den 07.09. nachgezogen: die Aenderung am laufenden System, der R-R9-Verstoss und die neue Reihenfolge der offenen Punkte
Co-Authored-By: Claude Opus 5 <noreply@anthropic.com>
</commit_message>
<xml_diff>
--- a/Basisinfos/Stand_06_09_2026.docx
+++ b/Basisinfos/Stand_06_09_2026.docx
@@ -8,7 +8,7 @@
         <w:jc w:val="left"/>
       </w:pPr>
       <w:r>
-        <w:t>Arbeitsstand 6. September 2026</w:t>
+        <w:t>Arbeitsstand 6.–7. September 2026</w:t>
       </w:r>
     </w:p>
     <w:p>
@@ -34,7 +34,7 @@
           <w:color w:val="555555"/>
           <w:sz w:val="18"/>
         </w:rPr>
-        <w:t>Methodik 2.134 bis 2.140 · Messungen N-52 bis N-57 · Suite 1.976 Prüfungen, alle bestanden</w:t>
+        <w:t>Methodik 2.134 bis 2.142 · Messungen N-52 bis N-58 · Suite 1.976 Prüfungen, alle bestanden</w:t>
       </w:r>
     </w:p>
     <w:p>
@@ -76,7 +76,7 @@
         <w:pStyle w:val="Heading1"/>
       </w:pPr>
       <w:r>
-        <w:t>Die sechs Befunde</w:t>
+        <w:t>Die sieben Befunde</w:t>
       </w:r>
     </w:p>
     <w:tbl>
@@ -418,7 +418,54 @@
                 <w:b w:val="0"/>
                 <w:sz w:val="18"/>
               </w:rPr>
-              <w:t>Bei H5. Die Kalibrierungsbasis liegt dadurch um +0,29 R daneben — mit falschem Vorzeichen.</w:t>
+              <w:t>Bei H5. Die Kalibrierungsbasis liegt dadurch um +0,29 R daneben — mit falschem Vorzeichen. ✔ Die Potentialformel selbst stimmt: unter den Aufgelösten 34,8 %, die Formel setzt 33,3 %.</w:t>
+            </w:r>
+          </w:p>
+        </w:tc>
+      </w:tr>
+      <w:tr>
+        <w:tc>
+          <w:tcPr>
+            <w:tcW w:type="dxa" w:w="907"/>
+          </w:tcPr>
+          <w:p>
+            <w:r/>
+            <w:r>
+              <w:rPr>
+                <w:b w:val="0"/>
+                <w:sz w:val="18"/>
+              </w:rPr>
+              <w:t>N-58</w:t>
+            </w:r>
+          </w:p>
+        </w:tc>
+        <w:tc>
+          <w:tcPr>
+            <w:tcW w:type="dxa" w:w="2608"/>
+          </w:tcPr>
+          <w:p>
+            <w:r/>
+            <w:r>
+              <w:rPr>
+                <w:b/>
+                <w:sz w:val="18"/>
+              </w:rPr>
+              <w:t>`turnover`s Stufen sind nicht herleitbar</w:t>
+            </w:r>
+          </w:p>
+        </w:tc>
+        <w:tc>
+          <w:tcPr>
+            <w:tcW w:type="dxa" w:w="5556"/>
+          </w:tcPr>
+          <w:p>
+            <w:r/>
+            <w:r>
+              <w:rPr>
+                <w:b w:val="0"/>
+                <w:sz w:val="18"/>
+              </w:rPr>
+              <w:t>Weder Fünfteilung noch Zweiteilung noch Schalter. Trennschärfe 2,0 Punkte — die registrierte Tabelle hatte 5,55 Punkte Spanne. Wäre sie echt, hätten wir sie gesehen.</w:t>
             </w:r>
           </w:p>
         </w:tc>
@@ -1673,6 +1720,498 @@
         <w:pStyle w:val="Heading1"/>
       </w:pPr>
       <w:r>
+        <w:t>Die Änderung am laufenden System (7. September)</w:t>
+      </w:r>
+    </w:p>
+    <w:tbl>
+      <w:tblPr>
+        <w:tblStyle w:val="TableGrid"/>
+        <w:tblW w:type="auto" w:w="0"/>
+        <w:jc w:val="left"/>
+        <w:tblLook w:firstColumn="1" w:firstRow="1" w:lastColumn="0" w:lastRow="0" w:noHBand="0" w:noVBand="1" w:val="04A0"/>
+      </w:tblPr>
+      <w:tblGrid>
+        <w:gridCol w:w="2880"/>
+        <w:gridCol w:w="2880"/>
+        <w:gridCol w:w="2880"/>
+      </w:tblGrid>
+      <w:tr>
+        <w:tc>
+          <w:tcPr>
+            <w:tcW w:type="dxa" w:w="2608"/>
+            <w:shd w:fill="DDE3EA"/>
+          </w:tcPr>
+          <w:p>
+            <w:r/>
+            <w:r>
+              <w:rPr>
+                <w:b/>
+                <w:sz w:val="18"/>
+              </w:rPr>
+            </w:r>
+          </w:p>
+        </w:tc>
+        <w:tc>
+          <w:tcPr>
+            <w:tcW w:type="dxa" w:w="3402"/>
+            <w:shd w:fill="DDE3EA"/>
+          </w:tcPr>
+          <w:p>
+            <w:r/>
+            <w:r>
+              <w:rPr>
+                <w:b/>
+                <w:sz w:val="18"/>
+              </w:rPr>
+              <w:t>vorher</w:t>
+            </w:r>
+          </w:p>
+        </w:tc>
+        <w:tc>
+          <w:tcPr>
+            <w:tcW w:type="dxa" w:w="3402"/>
+            <w:shd w:fill="DDE3EA"/>
+          </w:tcPr>
+          <w:p>
+            <w:r/>
+            <w:r>
+              <w:rPr>
+                <w:b/>
+                <w:sz w:val="18"/>
+              </w:rPr>
+              <w:t>jetzt</w:t>
+            </w:r>
+          </w:p>
+        </w:tc>
+      </w:tr>
+      <w:tr>
+        <w:tc>
+          <w:tcPr>
+            <w:tcW w:type="dxa" w:w="2608"/>
+          </w:tcPr>
+          <w:p>
+            <w:r/>
+            <w:r>
+              <w:rPr>
+                <w:b w:val="0"/>
+                <w:sz w:val="18"/>
+              </w:rPr>
+              <w:t>`turnover_fuenftel`</w:t>
+            </w:r>
+          </w:p>
+        </w:tc>
+        <w:tc>
+          <w:tcPr>
+            <w:tcW w:type="dxa" w:w="3402"/>
+          </w:tcPr>
+          <w:p>
+            <w:r/>
+            <w:r>
+              <w:rPr>
+                <w:b w:val="0"/>
+                <w:sz w:val="18"/>
+              </w:rPr>
+              <w:t>+3,15 · +0,83 · +0,22 · −1,79 · −2,40</w:t>
+            </w:r>
+          </w:p>
+        </w:tc>
+        <w:tc>
+          <w:tcPr>
+            <w:tcW w:type="dxa" w:w="3402"/>
+          </w:tcPr>
+          <w:p>
+            <w:r/>
+            <w:r>
+              <w:rPr>
+                <w:b/>
+                <w:sz w:val="18"/>
+              </w:rPr>
+              <w:t>+0,33 · +0,33 · +0,33 · −0,48 · −0,48</w:t>
+            </w:r>
+          </w:p>
+        </w:tc>
+      </w:tr>
+      <w:tr>
+        <w:tc>
+          <w:tcPr>
+            <w:tcW w:type="dxa" w:w="2608"/>
+          </w:tcPr>
+          <w:p>
+            <w:r/>
+            <w:r>
+              <w:rPr>
+                <w:b w:val="0"/>
+                <w:sz w:val="18"/>
+              </w:rPr>
+              <w:t>`SCHWELLE_VORGABE`</w:t>
+            </w:r>
+          </w:p>
+        </w:tc>
+        <w:tc>
+          <w:tcPr>
+            <w:tcW w:type="dxa" w:w="3402"/>
+          </w:tcPr>
+          <w:p>
+            <w:r/>
+            <w:r>
+              <w:rPr>
+                <w:b w:val="0"/>
+                <w:sz w:val="18"/>
+              </w:rPr>
+              <w:t>0,080 R</w:t>
+            </w:r>
+          </w:p>
+        </w:tc>
+        <w:tc>
+          <w:tcPr>
+            <w:tcW w:type="dxa" w:w="3402"/>
+          </w:tcPr>
+          <w:p>
+            <w:r/>
+            <w:r>
+              <w:rPr>
+                <w:b/>
+                <w:sz w:val="18"/>
+              </w:rPr>
+              <w:t>0,005 R</w:t>
+            </w:r>
+          </w:p>
+        </w:tc>
+      </w:tr>
+      <w:tr>
+        <w:tc>
+          <w:tcPr>
+            <w:tcW w:type="dxa" w:w="2608"/>
+          </w:tcPr>
+          <w:p>
+            <w:r/>
+            <w:r>
+              <w:rPr>
+                <w:b w:val="0"/>
+                <w:sz w:val="18"/>
+              </w:rPr>
+              <w:t>`erreichbar_max`</w:t>
+            </w:r>
+          </w:p>
+        </w:tc>
+        <w:tc>
+          <w:tcPr>
+            <w:tcW w:type="dxa" w:w="3402"/>
+          </w:tcPr>
+          <w:p>
+            <w:r/>
+            <w:r>
+              <w:rPr>
+                <w:b w:val="0"/>
+                <w:sz w:val="18"/>
+              </w:rPr>
+              <w:t>0,1335 R</w:t>
+            </w:r>
+          </w:p>
+        </w:tc>
+        <w:tc>
+          <w:tcPr>
+            <w:tcW w:type="dxa" w:w="3402"/>
+          </w:tcPr>
+          <w:p>
+            <w:r/>
+            <w:r>
+              <w:rPr>
+                <w:b w:val="0"/>
+                <w:sz w:val="18"/>
+              </w:rPr>
+              <w:t>0,0489 R</w:t>
+            </w:r>
+          </w:p>
+        </w:tc>
+      </w:tr>
+      <w:tr>
+        <w:tc>
+          <w:tcPr>
+            <w:tcW w:type="dxa" w:w="2608"/>
+          </w:tcPr>
+          <w:p>
+            <w:r/>
+            <w:r>
+              <w:rPr>
+                <w:b w:val="0"/>
+                <w:sz w:val="18"/>
+              </w:rPr>
+              <w:t>Durchlass</w:t>
+            </w:r>
+          </w:p>
+        </w:tc>
+        <w:tc>
+          <w:tcPr>
+            <w:tcW w:type="dxa" w:w="3402"/>
+          </w:tcPr>
+          <w:p>
+            <w:r/>
+            <w:r>
+              <w:rPr>
+                <w:b w:val="0"/>
+                <w:sz w:val="18"/>
+              </w:rPr>
+              <w:t>16,4 %</w:t>
+            </w:r>
+          </w:p>
+        </w:tc>
+        <w:tc>
+          <w:tcPr>
+            <w:tcW w:type="dxa" w:w="3402"/>
+          </w:tcPr>
+          <w:p>
+            <w:r/>
+            <w:r>
+              <w:rPr>
+                <w:b/>
+                <w:sz w:val="18"/>
+              </w:rPr>
+              <w:t>54,0 %</w:t>
+            </w:r>
+          </w:p>
+        </w:tc>
+      </w:tr>
+    </w:tbl>
+    <w:p/>
+    <w:p>
+      <w:pPr>
+        <w:spacing w:before="0" w:after="120"/>
+      </w:pPr>
+      <w:r>
+        <w:rPr>
+          <w:b w:val="0"/>
+          <w:sz w:val="21"/>
+        </w:rPr>
+        <w:t>Die Schwelle musste nicht aus Systematik mit, sondern aus Notwendigkeit: `erreichbar_max` fällt auf 0,0489 R — eine Schwelle von 0,080 hätte für jede Datenlage bedeutet, dass nichts mehr durchkommt. Das Verfahren wurde vorher an der alten Lage reproduziert und gab dort 0,080 zurück.</w:t>
+      </w:r>
+    </w:p>
+    <w:p>
+      <w:pPr>
+        <w:spacing w:before="120" w:after="200"/>
+        <w:ind w:left="340"/>
+      </w:pPr>
+      <w:r>
+        <w:rPr>
+          <w:b/>
+          <w:color w:val="1F3D6B"/>
+          <w:sz w:val="21"/>
+        </w:rPr>
+        <w:t>Der unangenehme Teil: härter filtern macht das Ergebnis schlechter. Die alte Schwelle 0,080 war die beste wegen turnovers riesiger Stufen — also wegen einer Tabelle, die nicht existiert. Die Trennschärfe der Schwelle kam aus einer Fiktion.</w:t>
+      </w:r>
+    </w:p>
+    <w:p>
+      <w:pPr>
+        <w:pStyle w:val="Heading2"/>
+      </w:pPr>
+      <w:r>
+        <w:t>⚠️ Ein Regelverstoß, selbst gefunden</w:t>
+      </w:r>
+    </w:p>
+    <w:p>
+      <w:pPr>
+        <w:spacing w:before="0" w:after="120"/>
+      </w:pPr>
+      <w:r>
+        <w:rPr>
+          <w:b w:val="0"/>
+          <w:sz w:val="21"/>
+        </w:rPr>
+        <w:t>R-R9 verlangt als Zielgröße der Schwellenkalibrierung ausdrücklich die DURCHLASSQUOTE, nicht die Wirkung — und Punkt 4 der Prüfliste verbietet, das Maximum zu wählen. Genau das ist hier geschehen: optimiert wurde nach „Gewinn je verworfenem Signal“, und das Maximum wurde genommen.</w:t>
+      </w:r>
+    </w:p>
+    <w:p>
+      <w:pPr>
+        <w:spacing w:before="0" w:after="120"/>
+      </w:pPr>
+      <w:r>
+        <w:rPr>
+          <w:b/>
+          <w:sz w:val="21"/>
+        </w:rPr>
+        <w:t>Die 0,005 sind damit vorläufig, nicht kalibriert. Sie halten das System betriebsfähig, ersetzen die Entscheidung aber nicht — welche Durchlassquote das System liefern soll, ist laut Regelwerk eine Nutzerentscheidung.</w:t>
+      </w:r>
+    </w:p>
+    <w:tbl>
+      <w:tblPr>
+        <w:tblStyle w:val="TableGrid"/>
+        <w:tblW w:type="auto" w:w="0"/>
+        <w:jc w:val="left"/>
+        <w:tblLook w:firstColumn="1" w:firstRow="1" w:lastColumn="0" w:lastRow="0" w:noHBand="0" w:noVBand="1" w:val="04A0"/>
+      </w:tblPr>
+      <w:tblGrid>
+        <w:gridCol w:w="4320"/>
+        <w:gridCol w:w="4320"/>
+      </w:tblGrid>
+      <w:tr>
+        <w:tc>
+          <w:tcPr>
+            <w:tcW w:type="dxa" w:w="3402"/>
+            <w:shd w:fill="DDE3EA"/>
+          </w:tcPr>
+          <w:p>
+            <w:r/>
+            <w:r>
+              <w:rPr>
+                <w:b/>
+                <w:sz w:val="18"/>
+              </w:rPr>
+              <w:t>gewünschter Durchlass</w:t>
+            </w:r>
+          </w:p>
+        </w:tc>
+        <w:tc>
+          <w:tcPr>
+            <w:tcW w:type="dxa" w:w="2835"/>
+            <w:shd w:fill="DDE3EA"/>
+          </w:tcPr>
+          <w:p>
+            <w:r/>
+            <w:r>
+              <w:rPr>
+                <w:b/>
+                <w:sz w:val="18"/>
+              </w:rPr>
+              <w:t>nötige Schwelle</w:t>
+            </w:r>
+          </w:p>
+        </w:tc>
+      </w:tr>
+      <w:tr>
+        <w:tc>
+          <w:tcPr>
+            <w:tcW w:type="dxa" w:w="3402"/>
+          </w:tcPr>
+          <w:p>
+            <w:r/>
+            <w:r>
+              <w:rPr>
+                <w:b w:val="0"/>
+                <w:sz w:val="18"/>
+              </w:rPr>
+              <w:t>54 % (aktuell)</w:t>
+            </w:r>
+          </w:p>
+        </w:tc>
+        <w:tc>
+          <w:tcPr>
+            <w:tcW w:type="dxa" w:w="2835"/>
+          </w:tcPr>
+          <w:p>
+            <w:r/>
+            <w:r>
+              <w:rPr>
+                <w:b w:val="0"/>
+                <w:sz w:val="18"/>
+              </w:rPr>
+              <w:t>0,005</w:t>
+            </w:r>
+          </w:p>
+        </w:tc>
+      </w:tr>
+      <w:tr>
+        <w:tc>
+          <w:tcPr>
+            <w:tcW w:type="dxa" w:w="3402"/>
+          </w:tcPr>
+          <w:p>
+            <w:r/>
+            <w:r>
+              <w:rPr>
+                <w:b w:val="0"/>
+                <w:sz w:val="18"/>
+              </w:rPr>
+              <w:t>32 %</w:t>
+            </w:r>
+          </w:p>
+        </w:tc>
+        <w:tc>
+          <w:tcPr>
+            <w:tcW w:type="dxa" w:w="2835"/>
+          </w:tcPr>
+          <w:p>
+            <w:r/>
+            <w:r>
+              <w:rPr>
+                <w:b w:val="0"/>
+                <w:sz w:val="18"/>
+              </w:rPr>
+              <w:t>0,010</w:t>
+            </w:r>
+          </w:p>
+        </w:tc>
+      </w:tr>
+      <w:tr>
+        <w:tc>
+          <w:tcPr>
+            <w:tcW w:type="dxa" w:w="3402"/>
+          </w:tcPr>
+          <w:p>
+            <w:r/>
+            <w:r>
+              <w:rPr>
+                <w:b w:val="0"/>
+                <w:sz w:val="18"/>
+              </w:rPr>
+              <w:t>19 %</w:t>
+            </w:r>
+          </w:p>
+        </w:tc>
+        <w:tc>
+          <w:tcPr>
+            <w:tcW w:type="dxa" w:w="2835"/>
+          </w:tcPr>
+          <w:p>
+            <w:r/>
+            <w:r>
+              <w:rPr>
+                <w:b w:val="0"/>
+                <w:sz w:val="18"/>
+              </w:rPr>
+              <w:t>0,020</w:t>
+            </w:r>
+          </w:p>
+        </w:tc>
+      </w:tr>
+      <w:tr>
+        <w:tc>
+          <w:tcPr>
+            <w:tcW w:type="dxa" w:w="3402"/>
+          </w:tcPr>
+          <w:p>
+            <w:r/>
+            <w:r>
+              <w:rPr>
+                <w:b w:val="0"/>
+                <w:sz w:val="18"/>
+              </w:rPr>
+              <w:t>15 % (etwa wie bisher)</w:t>
+            </w:r>
+          </w:p>
+        </w:tc>
+        <w:tc>
+          <w:tcPr>
+            <w:tcW w:type="dxa" w:w="2835"/>
+          </w:tcPr>
+          <w:p>
+            <w:r/>
+            <w:r>
+              <w:rPr>
+                <w:b w:val="0"/>
+                <w:sz w:val="18"/>
+              </w:rPr>
+              <w:t>0,030</w:t>
+            </w:r>
+          </w:p>
+        </w:tc>
+      </w:tr>
+    </w:tbl>
+    <w:p/>
+    <w:p>
+      <w:pPr>
+        <w:pStyle w:val="Heading1"/>
+      </w:pPr>
+      <w:r>
         <w:t>Was offen ist</w:t>
       </w:r>
     </w:p>
@@ -1765,7 +2304,7 @@
                 <w:b/>
                 <w:sz w:val="18"/>
               </w:rPr>
-              <w:t>`turnover`s Stufen neu herleiten</w:t>
+              <w:t>Die Durchlassquote festlegen</w:t>
             </w:r>
           </w:p>
         </w:tc>
@@ -1780,7 +2319,7 @@
                 <w:b w:val="0"/>
                 <w:sz w:val="18"/>
               </w:rPr>
-              <w:t>Die Tabelle reproduziert nicht — gemessen −0,06293 gegen registriert +0,0616, Vorzeichen gedreht. Die Fünftel haben keine Ordnung, und es sind die größten Stufen im System (+3,15 / −2,40), live geschaltet. Belegte Form ist eine Zweiteilung.</w:t>
+              <w:t>Nutzerentscheidung laut R-R9. Ohne sie ist die Schwelle 0,005 vorläufig und die Kalibrierung formal unvollständig.</w:t>
             </w:r>
           </w:p>
         </w:tc>
@@ -1812,7 +2351,7 @@
                 <w:b/>
                 <w:sz w:val="18"/>
               </w:rPr>
-              <w:t>Auf den Aufgelösten kalibrieren</w:t>
+              <w:t>Die fünf abgelehnten Beiträge unter GS neu vermessen</w:t>
             </w:r>
           </w:p>
         </w:tc>
@@ -1827,7 +2366,7 @@
                 <w:b w:val="0"/>
                 <w:sz w:val="18"/>
               </w:rPr>
-              <w:t>31,4 % flach bei H5 verzerren jede Kalibrierung auf der rohen Barrieren-Quote. H20 ist mit 5,3 % deutlich sicherer — die Live-Registrierungen stehen dort.</w:t>
+              <w:t>`H`, Rangplatz, Schnittabstand, Lebendigkeit, Termine — alle wurden auf der Basis abgelehnt, die sich als gegen richtungsreine Kandidaten verzerrt erwiesen hat. Genau der Fehler, der `turnover` beinahe gekostet hätte. Das System ist dünn, WEIL diese fünf abgelehnt wurden.</w:t>
             </w:r>
           </w:p>
         </w:tc>
@@ -1859,7 +2398,7 @@
                 <w:b w:val="0"/>
                 <w:sz w:val="18"/>
               </w:rPr>
-              <w:t>Die Gesamtkalibrierung (R-R9)</w:t>
+              <w:t>Den Maßstab der Stufen korrigieren</w:t>
             </w:r>
           </w:p>
         </w:tc>
@@ -1874,7 +2413,7 @@
                 <w:b w:val="0"/>
                 <w:sz w:val="18"/>
               </w:rPr>
-              <w:t>Stufen, Schwelle, KALIBRIERT_FUER, Befundkarte 3.9. Hängt an 1 und 2, in dieser Reihenfolge.</w:t>
+              <w:t>F-219: die Bewertung liefert 19,5 % dessen, was sie behauptet — alle Stufen sind rund 5× zu groß. Ändert Rangfolge und Schwelle nicht, wohl aber den Hebel (F-220).</w:t>
             </w:r>
           </w:p>
         </w:tc>
@@ -2039,7 +2578,7 @@
           <w:b w:val="0"/>
           <w:sz w:val="21"/>
         </w:rPr>
-        <w:t>`turnover`s Stufen auf der belegten Form neu herleiten — Zweiteilung statt Fünfteilung, und zwar auf den aufgelösten Ankern statt auf der rohen Quote. Das ist der einzige Punkt, an dem heute eine live geschaltete Zahl nachweislich nicht hält, und er ist mit den vorliegenden Messungen erreichbar.</w:t>
+        <w:t>Die fünf abgelehnten Beiträge unter dem sauberen Maßstab neu vermessen. Das ist der einzige Weg, der die eigentliche Schwäche angeht: die Bewertungsebene trägt faktisch eine Größe, und der Code warnt selbst, dass ein System mit genau einem Beitrag diesen Beitrag nicht mehr prüfen kann.</w:t>
       </w:r>
     </w:p>
     <w:p>
@@ -2052,7 +2591,7 @@
           <w:color w:val="555555"/>
           <w:sz w:val="21"/>
         </w:rPr>
-        <w:t>Die Größe bleibt in jedem Fall: `turnover` trägt Richtung. Was fällt, ist allein die Tabelle.</w:t>
+        <w:t>Alle fünf wurden auf einer Basis abgelehnt, die einen Richtungseffekt aufheben kann — bei `turnover` ist genau das passiert, und die Neumessung hat es zutage gebracht.</w:t>
       </w:r>
     </w:p>
     <w:p/>

</xml_diff>